<commit_message>
feat: CotiApp SaaS fases 0-8 (seguridad, org, UI, docs, go-live)
Entregables: entitlements/trial, multiempresa, design system, editor,
PDF/DOCX/share, reportes/equipo, hardening CI+PWA, import CSV clientes,
aceptacion por enlace y checkout Business. Pipeline listo para tag/deploy.

Co-authored-by: Cursor <cursoragent@cursor.com>
</commit_message>
<xml_diff>
--- a/assets/plantilla.docx
+++ b/assets/plantilla.docx
@@ -9,6 +9,25 @@
     </w:p>
     <w:p>
       <w:r>
+        <w:t>Subtítulo: </w:t>
+      </w:r>
+      <w:sdt xmlns:w="http://schemas.openxmlformats.org/wordprocessingml/2006/main">
+        <w:sdtPr>
+          <w:alias w:val="subtitulo"/>
+          <w:tag w:val="text"/>
+          <w:id w:val="24598777"/>
+        </w:sdtPr>
+        <w:sdtContent>
+          <w:p>
+            <w:r>
+              <w:t xml:space="preserve">Servicio profesional</w:t>
+            </w:r>
+          </w:p>
+        </w:sdtContent>
+      </w:sdt>
+    </w:p>
+    <w:p>
+      <w:r>
         <w:t>Número: </w:t>
       </w:r>
       <w:sdt xmlns:w="http://schemas.openxmlformats.org/wordprocessingml/2006/main">
@@ -47,6 +66,25 @@
     </w:p>
     <w:p>
       <w:r>
+        <w:t>Estado: </w:t>
+      </w:r>
+      <w:sdt xmlns:w="http://schemas.openxmlformats.org/wordprocessingml/2006/main">
+        <w:sdtPr>
+          <w:alias w:val="estado"/>
+          <w:tag w:val="text"/>
+          <w:id w:val="237140183"/>
+        </w:sdtPr>
+        <w:sdtContent>
+          <w:p>
+            <w:r>
+              <w:t xml:space="preserve">draft</w:t>
+            </w:r>
+          </w:p>
+        </w:sdtContent>
+      </w:sdt>
+    </w:p>
+    <w:p>
+      <w:r>
         <w:t>Cliente: </w:t>
       </w:r>
       <w:sdt xmlns:w="http://schemas.openxmlformats.org/wordprocessingml/2006/main">
@@ -154,6 +192,25 @@
           <w:p>
             <w:r>
               <w:t xml:space="preserve">Descripción del servicio...</w:t>
+            </w:r>
+          </w:p>
+        </w:sdtContent>
+      </w:sdt>
+    </w:p>
+    <w:p>
+      <w:r>
+        <w:t>Validez (días): </w:t>
+      </w:r>
+      <w:sdt xmlns:w="http://schemas.openxmlformats.org/wordprocessingml/2006/main">
+        <w:sdtPr>
+          <w:alias w:val="validezDias"/>
+          <w:tag w:val="text"/>
+          <w:id w:val="922958029"/>
+        </w:sdtPr>
+        <w:sdtContent>
+          <w:p>
+            <w:r>
+              <w:t xml:space="preserve">30</w:t>
             </w:r>
           </w:p>
         </w:sdtContent>
@@ -195,14 +252,14 @@
         <w:tc>
           <w:p>
             <w:r>
-              <w:t>Descripción</w:t>
+              <w:t>Descripción / qty · dto · imp</w:t>
             </w:r>
           </w:p>
         </w:tc>
         <w:tc>
           <w:p>
             <w:r>
-              <w:t>Precio (USD)</w:t>
+              <w:t>Neto (USD)</w:t>
             </w:r>
           </w:p>
         </w:tc>
@@ -357,6 +414,63 @@
         </w:p>
       </w:sdtContent>
     </w:sdt>
+    <w:p>
+      <w:r>
+        <w:t/>
+      </w:r>
+      <w:sdt xmlns:w="http://schemas.openxmlformats.org/wordprocessingml/2006/main">
+        <w:sdtPr>
+          <w:alias w:val="firmaTecnico"/>
+          <w:tag w:val="text"/>
+          <w:id w:val="622395969"/>
+        </w:sdtPr>
+        <w:sdtContent>
+          <w:p>
+            <w:r>
+              <w:t xml:space="preserve">Firma del Técnico</w:t>
+            </w:r>
+          </w:p>
+        </w:sdtContent>
+      </w:sdt>
+    </w:p>
+    <w:p>
+      <w:r>
+        <w:t/>
+      </w:r>
+      <w:sdt xmlns:w="http://schemas.openxmlformats.org/wordprocessingml/2006/main">
+        <w:sdtPr>
+          <w:alias w:val="firmaCliente"/>
+          <w:tag w:val="text"/>
+          <w:id w:val="901716309"/>
+        </w:sdtPr>
+        <w:sdtContent>
+          <w:p>
+            <w:r>
+              <w:t xml:space="preserve">Firma del Cliente</w:t>
+            </w:r>
+          </w:p>
+        </w:sdtContent>
+      </w:sdt>
+    </w:p>
+    <w:p>
+      <w:r>
+        <w:t/>
+      </w:r>
+      <w:sdt xmlns:w="http://schemas.openxmlformats.org/wordprocessingml/2006/main">
+        <w:sdtPr>
+          <w:alias w:val="footerText"/>
+          <w:tag w:val="text"/>
+          <w:id w:val="511290448"/>
+        </w:sdtPr>
+        <w:sdtContent>
+          <w:p>
+            <w:r>
+              <w:t xml:space="preserve">Documento confidencial</w:t>
+            </w:r>
+          </w:p>
+        </w:sdtContent>
+      </w:sdt>
+    </w:p>
     <w:sectPr>
       <w:pgSz w:w="11906" w:h="16838"/>
       <w:pgMar w:top="1440" w:right="1440" w:bottom="1440" w:left="1440"/>

</xml_diff>